<commit_message>
Sync final $906 charts, updated documents, and add MIT License
</commit_message>
<xml_diff>
--- a/report/On_BLK_Two_Lenses.docx
+++ b/report/On_BLK_Two_Lenses.docx
@@ -69,7 +69,7 @@
           <w:sz w:val="17"/>
           <w:szCs w:val="17"/>
         </w:rPr>
-        <w:t xml:space="preserve">	W.H. Blackburn  ·  June 2026</w:t>
+        <w:t xml:space="preserve">	W.H. Blackburn  ·  April 2026</w:t>
       </w:r>
     </w:p>
     <w:p>
@@ -174,7 +174,7 @@
                 <w:sz w:val="22"/>
                 <w:szCs w:val="22"/>
               </w:rPr>
-              <w:t xml:space="preserve">$959</w:t>
+              <w:t xml:space="preserve">$906</w:t>
             </w:r>
           </w:p>
         </w:tc>
@@ -219,7 +219,7 @@
                 <w:sz w:val="22"/>
                 <w:szCs w:val="22"/>
               </w:rPr>
-              <w:t xml:space="preserve">~$1,050</w:t>
+              <w:t xml:space="preserve">$1,085</w:t>
             </w:r>
           </w:p>
         </w:tc>
@@ -264,7 +264,7 @@
                 <w:sz w:val="22"/>
                 <w:szCs w:val="22"/>
               </w:rPr>
-              <w:t xml:space="preserve">−8%</w:t>
+              <w:t xml:space="preserve">−16.5%</w:t>
             </w:r>
           </w:p>
         </w:tc>
@@ -300,7 +300,7 @@
                 <w:sz w:val="18"/>
                 <w:szCs w:val="18"/>
               </w:rPr>
-              <w:t xml:space="preserve">Add &lt; $960</w:t>
+              <w:t xml:space="preserve">Accumulate &lt;$900</w:t>
             </w:r>
           </w:p>
         </w:tc>
@@ -380,7 +380,7 @@
                 <w:sz w:val="20"/>
                 <w:szCs w:val="20"/>
               </w:rPr>
-              <w:t xml:space="preserve">$13.9T</w:t>
+              <w:t xml:space="preserve">$14.0T</w:t>
             </w:r>
           </w:p>
         </w:tc>
@@ -415,7 +415,7 @@
                 <w:sz w:val="13"/>
                 <w:szCs w:val="13"/>
               </w:rPr>
-              <w:t xml:space="preserve">LTM NET FLOWS</w:t>
+              <w:t xml:space="preserve">2025 NET FLOWS</w:t>
             </w:r>
           </w:p>
           <w:p>
@@ -432,7 +432,7 @@
                 <w:sz w:val="20"/>
                 <w:szCs w:val="20"/>
               </w:rPr>
-              <w:t xml:space="preserve">$744B</w:t>
+              <w:t xml:space="preserve">$698B</w:t>
             </w:r>
           </w:p>
         </w:tc>
@@ -484,7 +484,7 @@
                 <w:sz w:val="20"/>
                 <w:szCs w:val="20"/>
               </w:rPr>
-              <w:t xml:space="preserve">~44%</w:t>
+              <w:t xml:space="preserve">44.1%</w:t>
             </w:r>
           </w:p>
         </w:tc>
@@ -588,7 +588,7 @@
                 <w:sz w:val="20"/>
                 <w:szCs w:val="20"/>
               </w:rPr>
-              <w:t xml:space="preserve">~$163B</w:t>
+              <w:t xml:space="preserve">~$168B</w:t>
             </w:r>
           </w:p>
         </w:tc>
@@ -705,10 +705,10 @@
           <w:b/>
           <w:bCs/>
         </w:rPr>
-        <w:t xml:space="preserve">$959</w:t>
-      </w:r>
-      <w:r>
-        <w:t xml:space="preserve">. The evidence leans toward the platform lens: in the 2022 drawdown, operating income fell ~13% against a ~19% market decline — not the signature of a plain beta machine. But a better company is not the same as a better price. At ~$1,050 the market has adopted a third, more generous lens than either of mine, and it is paying for a durability in private credit that BlackRock’s own March 2026 decision to gate ~$1.2B of redemptions has just called into question. I rate the shares HOLD and become a buyer in the high-$900s, where the two lenses converge.</w:t>
+        <w:t xml:space="preserve">$906</w:t>
+      </w:r>
+      <w:r>
+        <w:t xml:space="preserve">. The evidence leans toward the platform lens: in the 2022 drawdown, operating income fell ~13% against a ~19% market decline — not the signature of a plain beta machine. But a better company is not the same as a better price. At $1,085 the market has adopted a third, more generous lens than either of mine, and it is paying for a durability in private credit that BlackRock’s own March 2026 decision to gate ~$1.2B of redemptions has just called into question. I rate the shares HOLD with a trim bias and become a buyer in the high-$800s, where the two lenses converge.</w:t>
       </w:r>
     </w:p>
     <w:p>
@@ -951,7 +951,7 @@
                 <w:sz w:val="18"/>
                 <w:szCs w:val="18"/>
               </w:rPr>
-              <w:t xml:space="preserve">Directionally I agree on quality — but the market is pricing a durability the March/June 2026 redemption gates have not yet earned.</w:t>
+              <w:t xml:space="preserve">Directionally I agree on quality — but the market is pricing a durability the March 2026 redemption gate has not yet earned.</w:t>
             </w:r>
           </w:p>
         </w:tc>
@@ -1193,7 +1193,7 @@
                 <w:sz w:val="17"/>
                 <w:szCs w:val="17"/>
               </w:rPr>
-              <w:t xml:space="preserve">~$1,147  (+9%)</w:t>
+              <w:t xml:space="preserve">~$1,147  (+6%)</w:t>
             </w:r>
           </w:p>
         </w:tc>
@@ -1297,7 +1297,7 @@
                 <w:sz w:val="17"/>
                 <w:szCs w:val="17"/>
               </w:rPr>
-              <w:t xml:space="preserve">$959  (−8%)</w:t>
+              <w:t xml:space="preserve">$906  (−16.5%)</w:t>
             </w:r>
           </w:p>
         </w:tc>
@@ -1401,7 +1401,7 @@
                 <w:sz w:val="17"/>
                 <w:szCs w:val="17"/>
               </w:rPr>
-              <w:t xml:space="preserve">~$825  (−21%)</w:t>
+              <w:t xml:space="preserve">~$825  (−24%)</w:t>
             </w:r>
           </w:p>
         </w:tc>
@@ -1460,7 +1460,7 @@
           <w:sz w:val="18"/>
           <w:szCs w:val="18"/>
         </w:rPr>
-        <w:t xml:space="preserve">+9% to the bull against −21% to the bear</w:t>
+        <w:t xml:space="preserve">+6% to the bull against −24% to the bear</w:t>
       </w:r>
       <w:r>
         <w:rPr>
@@ -1589,7 +1589,7 @@
           <w:b/>
           <w:bCs/>
         </w:rPr>
-        <w:t xml:space="preserve">$959.</w:t>
+        <w:t xml:space="preserve">$906.</w:t>
       </w:r>
     </w:p>
     <w:p>
@@ -1712,7 +1712,7 @@
         <w:t xml:space="preserve">gated roughly $1.2B of redemptions</w:t>
       </w:r>
       <w:r>
-        <w:t xml:space="preserve"> in a private-credit vehicle, and renewed redemption pressure surfaced again in June. Gating is what funds do, not what toll roads do.</w:t>
+        <w:t xml:space="preserve"> in a private-credit vehicle. Gating is what funds do, not what toll roads do.</w:t>
       </w:r>
     </w:p>
     <w:p>
@@ -1785,7 +1785,7 @@
         <w:jc w:val="both"/>
       </w:pPr>
       <w:r>
-        <w:t xml:space="preserve">Put the two intrinsic reads on a number line — $825 and $959 — then add the Street’s ~$1,150–1,250 targets and a ~$1,050 price. The market is not choosing between my lenses; it has adopted a third, more optimistic one. Q1 2026 gave it reason to: $130B of quarterly inflows, $744B over the trailing year, 10% organic base-fee growth (the best first quarter in five years), Aladdin ACV +14%, and adjusted margins up over 100 basis points. This is a business visibly accelerating, and the bull is not imagining things.</w:t>
+        <w:t xml:space="preserve">Put the two intrinsic reads on a number line — $825 and $906 — then add the Street’s ~$1,150–1,250 targets and a ~$1,085 price. The market is not choosing between my lenses; it has adopted a third, more optimistic one. Q1 2026 gave it reason to: $130B of quarterly inflows, $744B over the trailing year, 10% organic base-fee growth (the best first quarter in five years), Aladdin ACV +14%, and adjusted margins up over 100 basis points. This is a business visibly accelerating, and the bull is not imagining things.</w:t>
       </w:r>
     </w:p>
     <w:p>
@@ -1804,17 +1804,17 @@
         <w:t xml:space="preserve">already in the price</w:t>
       </w:r>
       <w:r>
-        <w:t xml:space="preserve">. The rate backdrop has turned against the AUM book — the 10-year near 4.45%, a hawkish Fed under new chair Warsh, with roughly half the committee now penciling a 2026 </w:t>
+        <w:t xml:space="preserve">. The rate backdrop has turned against the AUM book — the 10-year near 4.3% and a Fed in no hurry to cut, with the market pricing </w:t>
       </w:r>
       <w:r>
         <w:rPr>
           <w:i/>
           <w:iCs/>
         </w:rPr>
-        <w:t xml:space="preserve">hike</w:t>
-      </w:r>
-      <w:r>
-        <w:t xml:space="preserve">. And the private-credit cracks argue for more conservatism on exactly the cash flows the premium depends on. At ~$1,050 you are paying full price for the optimistic case while the marginal new evidence is mixed.</w:t>
+        <w:t xml:space="preserve">higher-for-longer</w:t>
+      </w:r>
+      <w:r>
+        <w:t xml:space="preserve">. And the private-credit cracks argue for more conservatism on exactly the cash flows the premium depends on. At $1,085 you are paying full price for the optimistic case while the marginal new evidence is mixed.</w:t>
       </w:r>
     </w:p>
     <w:p>
@@ -1823,7 +1823,127 @@
         <w:spacing w:after="120" w:before="260"/>
       </w:pPr>
       <w:r>
-        <w:t xml:space="preserve">V.  What would flip the lens</w:t>
+        <w:t xml:space="preserve">V.  Market-Implied Expectations (Reverse DCF)</w:t>
+      </w:r>
+    </w:p>
+    <w:p>
+      <w:pPr>
+        <w:spacing w:after="140" w:line="264"/>
+        <w:jc w:val="both"/>
+      </w:pPr>
+      <w:r>
+        <w:t xml:space="preserve">The intrinsic work says what BlackRock is worth; it does not say what the market is paying for. Following Mauboussin &amp; Rappaport, I invert the model — holding the cap-consistent structure fixed and solving for the expectations embedded in the $1,085 price. The market capitalizes BlackRock roughly </w:t>
+      </w:r>
+      <w:r>
+        <w:rPr>
+          <w:b/>
+          <w:bCs/>
+        </w:rPr>
+        <w:t xml:space="preserve">$177 a share (~$27.5B) above the $906 central case</w:t>
+      </w:r>
+      <w:r>
+        <w:t xml:space="preserve">. That premium is justified only if one of three things is true: iShares FCFE compounds at ~11% for five years (versus the ~6.5% my franchise analysis supports); the blended cost of equity is ~8.1% rather than 8.9% (the market treating BlackRock as materially more durable than its segment betas imply); or the franchise premium is ~$239 a share rather than the ~$62 my cap-honest model assigns. Framed as scenarios, the price embeds roughly a </w:t>
+      </w:r>
+      <w:r>
+        <w:rPr>
+          <w:b/>
+          <w:bCs/>
+        </w:rPr>
+        <w:t xml:space="preserve">74% probability of the bull case over the base</w:t>
+      </w:r>
+      <w:r>
+        <w:t xml:space="preserve">.</w:t>
+      </w:r>
+    </w:p>
+    <w:p>
+      <w:pPr>
+        <w:spacing w:after="140" w:line="264"/>
+        <w:jc w:val="both"/>
+      </w:pPr>
+      <w:r>
+        <w:t xml:space="preserve">None of these is implausible — but each requires the platform flywheel to compound at a rate that recent evidence, particularly the March 2026 private-credit gating, has not confirmed. The market is not mispricing BlackRock so much as </w:t>
+      </w:r>
+      <w:r>
+        <w:rPr>
+          <w:i/>
+          <w:iCs/>
+        </w:rPr>
+        <w:t xml:space="preserve">pre-pricing a durability that remains unproven</w:t>
+      </w:r>
+      <w:r>
+        <w:t xml:space="preserve">. A probability-weighted expected value across the bull, base, bear, and tail scenarios lands at roughly $877–$930 a share — in every case below the prevailing price, which is what tips the central-case HOLD toward a modest trim bias at current levels.</w:t>
+      </w:r>
+    </w:p>
+    <w:p>
+      <w:pPr>
+        <w:spacing w:after="40" w:before="60"/>
+        <w:jc w:val="center"/>
+      </w:pPr>
+      <w:r>
+        <w:drawing>
+          <wp:inline distT="0" distB="0" distL="0" distR="0">
+            <wp:extent cx="5029200" cy="5029200"/>
+            <wp:effectExtent t="0" r="0" b="0" l="0"/>
+            <wp:docPr id="1" name="" descr="" title=""/>
+            <wp:cNvGraphicFramePr>
+              <a:graphicFrameLocks xmlns:a="http://schemas.openxmlformats.org/drawingml/2006/main" noChangeAspect="1"/>
+            </wp:cNvGraphicFramePr>
+            <a:graphic xmlns:a="http://schemas.openxmlformats.org/drawingml/2006/main">
+              <a:graphicData uri="http://schemas.openxmlformats.org/drawingml/2006/picture">
+                <pic:pic xmlns:pic="http://schemas.openxmlformats.org/drawingml/2006/picture">
+                  <pic:nvPicPr>
+                    <pic:cNvPr id="0" name="" descr=""/>
+                    <pic:cNvPicPr>
+                      <a:picLocks noChangeAspect="1" noChangeArrowheads="1"/>
+                    </pic:cNvPicPr>
+                  </pic:nvPicPr>
+                  <pic:blipFill>
+                    <a:blip r:embed="rId8" cstate="none"/>
+                    <a:srcRect/>
+                    <a:stretch>
+                      <a:fillRect/>
+                    </a:stretch>
+                  </pic:blipFill>
+                  <pic:spPr bwMode="auto">
+                    <a:xfrm>
+                      <a:off x="0" y="0"/>
+                      <a:ext cx="5029200" cy="5029200"/>
+                    </a:xfrm>
+                    <a:prstGeom prst="rect">
+                      <a:avLst/>
+                    </a:prstGeom>
+                  </pic:spPr>
+                </pic:pic>
+              </a:graphicData>
+            </a:graphic>
+          </wp:inline>
+        </w:drawing>
+      </w:r>
+    </w:p>
+    <w:p>
+      <w:pPr>
+        <w:spacing w:after="160"/>
+        <w:jc w:val="center"/>
+      </w:pPr>
+      <w:r>
+        <w:rPr>
+          <w:rFonts w:ascii="Arial" w:cs="Arial" w:eastAsia="Arial" w:hAnsi="Arial"/>
+          <w:i/>
+          <w:iCs/>
+          <w:color w:val="6B6B73"/>
+          <w:sz w:val="15"/>
+          <w:szCs w:val="15"/>
+        </w:rPr>
+        <w:t xml:space="preserve">The expectations ladder — each rung is the belief required to justify that price. The market sits above even the single-stage Aladdin read.</w:t>
+      </w:r>
+    </w:p>
+    <w:p>
+      <w:pPr>
+        <w:pStyle w:val="Heading1"/>
+        <w:spacing w:after="120" w:before="260"/>
+      </w:pPr>
+      <w:r>
+        <w:t xml:space="preserve">VI.  What would flip the lens</w:t>
       </w:r>
     </w:p>
     <w:p>
@@ -2520,7 +2640,7 @@
                 <w:sz w:val="17"/>
                 <w:szCs w:val="17"/>
               </w:rPr>
-              <w:t xml:space="preserve">Fed rate path under Warsh</w:t>
+              <w:t xml:space="preserve">Fed rate path</w:t>
             </w:r>
           </w:p>
         </w:tc>
@@ -2734,7 +2854,7 @@
         <w:spacing w:after="120" w:before="260"/>
       </w:pPr>
       <w:r>
-        <w:t xml:space="preserve">VI.  Recommendation</w:t>
+        <w:t xml:space="preserve">VII.  Recommendation</w:t>
       </w:r>
     </w:p>
     <w:p>
@@ -2747,10 +2867,10 @@
           <w:b/>
           <w:bCs/>
         </w:rPr>
-        <w:t xml:space="preserve">HOLD, $959 target. </w:t>
-      </w:r>
-      <w:r>
-        <w:t xml:space="preserve">For existing holders, the franchise is durable and the gap to fair value reflects discount-rate and price dynamics, not business deterioration — hold through volatility. For new capital, discipline pays: the high-$900s is where the two lenses converge and the risk/reward turns favorable. The stock has traded as low as ~$917 in the past year, so the entry I want is not hypothetical.</w:t>
+        <w:t xml:space="preserve">HOLD with a trim bias, $906 target. </w:t>
+      </w:r>
+      <w:r>
+        <w:t xml:space="preserve">For existing holders, the franchise is durable and the gap to fair value reflects discount-rate and price dynamics, not business deterioration — hold through volatility. For new capital, discipline pays: the high-$800s is where the two lenses converge and the risk/reward turns favorable — a pullback the stock has not offered in the past year (the 52-week low is ~$917), but the one worth waiting for.</w:t>
       </w:r>
     </w:p>
     <w:tbl>
@@ -2801,7 +2921,7 @@
                 <w:sz w:val="18"/>
                 <w:szCs w:val="18"/>
               </w:rPr>
-              <w:t xml:space="preserve">Above ~$1,150</w:t>
+              <w:t xml:space="preserve">Above ~$1,000</w:t>
             </w:r>
           </w:p>
         </w:tc>
@@ -2834,7 +2954,7 @@
                 <w:sz w:val="18"/>
                 <w:szCs w:val="18"/>
               </w:rPr>
-              <w:t xml:space="preserve">Trim — price exceeds even the platform-compounder central case.</w:t>
+              <w:t xml:space="preserve">Trim — price sits well above the $906 central case.</w:t>
             </w:r>
           </w:p>
         </w:tc>
@@ -2871,7 +2991,7 @@
                 <w:sz w:val="18"/>
                 <w:szCs w:val="18"/>
               </w:rPr>
-              <w:t xml:space="preserve">$960 – $1,150</w:t>
+              <w:t xml:space="preserve">$900 – $1,000</w:t>
             </w:r>
           </w:p>
         </w:tc>
@@ -2904,7 +3024,7 @@
                 <w:sz w:val="18"/>
                 <w:szCs w:val="18"/>
               </w:rPr>
-              <w:t xml:space="preserve">Hold at target weight; do not add.</w:t>
+              <w:t xml:space="preserve">Hold; trim into further strength.</w:t>
             </w:r>
           </w:p>
         </w:tc>
@@ -2941,7 +3061,7 @@
                 <w:sz w:val="18"/>
                 <w:szCs w:val="18"/>
               </w:rPr>
-              <w:t xml:space="preserve">$875 – $960</w:t>
+              <w:t xml:space="preserve">$850 – $900</w:t>
             </w:r>
           </w:p>
         </w:tc>
@@ -2974,7 +3094,7 @@
                 <w:sz w:val="18"/>
                 <w:szCs w:val="18"/>
               </w:rPr>
-              <w:t xml:space="preserve">Accumulate on confirmation of Aladdin ACV or HPS scaling milestones.</w:t>
+              <w:t xml:space="preserve">Accumulate on confirmation of Aladdin ACV or HPS scaling.</w:t>
             </w:r>
           </w:p>
         </w:tc>
@@ -3011,7 +3131,7 @@
                 <w:sz w:val="18"/>
                 <w:szCs w:val="18"/>
               </w:rPr>
-              <w:t xml:space="preserve">Below ~$875</w:t>
+              <w:t xml:space="preserve">Below ~$825</w:t>
             </w:r>
           </w:p>
         </w:tc>
@@ -3044,7 +3164,7 @@
                 <w:sz w:val="18"/>
                 <w:szCs w:val="18"/>
               </w:rPr>
-              <w:t xml:space="preserve">Buy aggressively — price approaches the rate-sensitive floor.</w:t>
+              <w:t xml:space="preserve">Buy aggressively — at or below the rate-sensitive floor.</w:t>
             </w:r>
           </w:p>
         </w:tc>
@@ -3057,7 +3177,7 @@
         <w:spacing w:after="120" w:before="0"/>
       </w:pPr>
       <w:r>
-        <w:t xml:space="preserve">VII.  How the $959 is built</w:t>
+        <w:t xml:space="preserve">VIII.  How the $906 is built</w:t>
       </w:r>
     </w:p>
     <w:p>
@@ -4721,7 +4841,7 @@
                 <w:sz w:val="17"/>
                 <w:szCs w:val="17"/>
               </w:rPr>
-              <w:t xml:space="preserve">Plus: platform / operating-leverage overlay</w:t>
+              <w:t xml:space="preserve">Plus: iShares operating-leverage overlay</w:t>
             </w:r>
           </w:p>
         </w:tc>
@@ -4849,7 +4969,7 @@
                 <w:sz w:val="17"/>
                 <w:szCs w:val="17"/>
               </w:rPr>
-              <w:t xml:space="preserve">+$17.7B</w:t>
+              <w:t xml:space="preserve">+$17.8B</w:t>
             </w:r>
           </w:p>
         </w:tc>
@@ -4881,7 +5001,395 @@
                 <w:sz w:val="17"/>
                 <w:szCs w:val="17"/>
               </w:rPr>
-              <w:t xml:space="preserve">+$114</w:t>
+              <w:t xml:space="preserve">+$115</w:t>
+            </w:r>
+          </w:p>
+        </w:tc>
+      </w:tr>
+      <w:tr>
+        <w:tc>
+          <w:tcPr>
+            <w:tcW w:type="dxa" w:w="3680"/>
+            <w:tcBorders>
+              <w:top w:val="single" w:color="D9D5CC" w:sz="2"/>
+              <w:left w:val="single" w:color="D9D5CC" w:sz="2"/>
+              <w:bottom w:val="single" w:color="D9D5CC" w:sz="2"/>
+              <w:right w:val="single" w:color="D9D5CC" w:sz="2"/>
+            </w:tcBorders>
+            <w:tcMar>
+              <w:top w:type="dxa" w:w="70"/>
+              <w:left w:type="dxa" w:w="120"/>
+              <w:bottom w:type="dxa" w:w="70"/>
+              <w:right w:type="dxa" w:w="120"/>
+            </w:tcMar>
+            <w:vAlign w:val="center"/>
+          </w:tcPr>
+          <w:p>
+            <w:pPr>
+              <w:spacing w:after="0" w:line="240"/>
+              <w:jc w:val="left"/>
+            </w:pPr>
+            <w:r>
+              <w:rPr>
+                <w:rFonts w:ascii="Georgia" w:cs="Georgia" w:eastAsia="Georgia" w:hAnsi="Georgia"/>
+                <w:sz w:val="17"/>
+                <w:szCs w:val="17"/>
+              </w:rPr>
+              <w:t xml:space="preserve">Less: Aladdin terminal-cap adjustment</w:t>
+            </w:r>
+          </w:p>
+        </w:tc>
+        <w:tc>
+          <w:tcPr>
+            <w:tcW w:type="dxa" w:w="1400"/>
+            <w:tcBorders>
+              <w:top w:val="single" w:color="D9D5CC" w:sz="2"/>
+              <w:left w:val="single" w:color="D9D5CC" w:sz="2"/>
+              <w:bottom w:val="single" w:color="D9D5CC" w:sz="2"/>
+              <w:right w:val="single" w:color="D9D5CC" w:sz="2"/>
+            </w:tcBorders>
+            <w:tcMar>
+              <w:top w:type="dxa" w:w="70"/>
+              <w:left w:type="dxa" w:w="120"/>
+              <w:bottom w:type="dxa" w:w="70"/>
+              <w:right w:type="dxa" w:w="120"/>
+            </w:tcMar>
+            <w:vAlign w:val="center"/>
+          </w:tcPr>
+          <w:p>
+            <w:pPr>
+              <w:spacing w:after="0" w:line="240"/>
+              <w:jc w:val="left"/>
+            </w:pPr>
+            <w:r>
+              <w:rPr>
+                <w:rFonts w:ascii="Georgia" w:cs="Georgia" w:eastAsia="Georgia" w:hAnsi="Georgia"/>
+                <w:sz w:val="19"/>
+                <w:szCs w:val="19"/>
+              </w:rPr>
+              <w:t xml:space="preserve"/>
+            </w:r>
+          </w:p>
+        </w:tc>
+        <w:tc>
+          <w:tcPr>
+            <w:tcW w:type="dxa" w:w="900"/>
+            <w:tcBorders>
+              <w:top w:val="single" w:color="D9D5CC" w:sz="2"/>
+              <w:left w:val="single" w:color="D9D5CC" w:sz="2"/>
+              <w:bottom w:val="single" w:color="D9D5CC" w:sz="2"/>
+              <w:right w:val="single" w:color="D9D5CC" w:sz="2"/>
+            </w:tcBorders>
+            <w:tcMar>
+              <w:top w:type="dxa" w:w="70"/>
+              <w:left w:type="dxa" w:w="120"/>
+              <w:bottom w:type="dxa" w:w="70"/>
+              <w:right w:type="dxa" w:w="120"/>
+            </w:tcMar>
+            <w:vAlign w:val="center"/>
+          </w:tcPr>
+          <w:p>
+            <w:pPr>
+              <w:spacing w:after="0" w:line="240"/>
+              <w:jc w:val="left"/>
+            </w:pPr>
+            <w:r>
+              <w:rPr>
+                <w:rFonts w:ascii="Georgia" w:cs="Georgia" w:eastAsia="Georgia" w:hAnsi="Georgia"/>
+                <w:sz w:val="19"/>
+                <w:szCs w:val="19"/>
+              </w:rPr>
+              <w:t xml:space="preserve"/>
+            </w:r>
+          </w:p>
+        </w:tc>
+        <w:tc>
+          <w:tcPr>
+            <w:tcW w:type="dxa" w:w="1100"/>
+            <w:tcBorders>
+              <w:top w:val="single" w:color="D9D5CC" w:sz="2"/>
+              <w:left w:val="single" w:color="D9D5CC" w:sz="2"/>
+              <w:bottom w:val="single" w:color="D9D5CC" w:sz="2"/>
+              <w:right w:val="single" w:color="D9D5CC" w:sz="2"/>
+            </w:tcBorders>
+            <w:tcMar>
+              <w:top w:type="dxa" w:w="70"/>
+              <w:left w:type="dxa" w:w="120"/>
+              <w:bottom w:type="dxa" w:w="70"/>
+              <w:right w:type="dxa" w:w="120"/>
+            </w:tcMar>
+            <w:vAlign w:val="center"/>
+          </w:tcPr>
+          <w:p>
+            <w:pPr>
+              <w:spacing w:after="0" w:line="240"/>
+              <w:jc w:val="left"/>
+            </w:pPr>
+            <w:r>
+              <w:rPr>
+                <w:rFonts w:ascii="Georgia" w:cs="Georgia" w:eastAsia="Georgia" w:hAnsi="Georgia"/>
+                <w:sz w:val="19"/>
+                <w:szCs w:val="19"/>
+              </w:rPr>
+              <w:t xml:space="preserve"/>
+            </w:r>
+          </w:p>
+        </w:tc>
+        <w:tc>
+          <w:tcPr>
+            <w:tcW w:type="dxa" w:w="1500"/>
+            <w:tcBorders>
+              <w:top w:val="single" w:color="D9D5CC" w:sz="2"/>
+              <w:left w:val="single" w:color="D9D5CC" w:sz="2"/>
+              <w:bottom w:val="single" w:color="D9D5CC" w:sz="2"/>
+              <w:right w:val="single" w:color="D9D5CC" w:sz="2"/>
+            </w:tcBorders>
+            <w:tcMar>
+              <w:top w:type="dxa" w:w="70"/>
+              <w:left w:type="dxa" w:w="120"/>
+              <w:bottom w:type="dxa" w:w="70"/>
+              <w:right w:type="dxa" w:w="120"/>
+            </w:tcMar>
+            <w:vAlign w:val="center"/>
+          </w:tcPr>
+          <w:p>
+            <w:pPr>
+              <w:spacing w:after="0" w:line="240"/>
+              <w:jc w:val="center"/>
+            </w:pPr>
+            <w:r>
+              <w:rPr>
+                <w:rFonts w:ascii="Georgia" w:cs="Georgia" w:eastAsia="Georgia" w:hAnsi="Georgia"/>
+                <w:sz w:val="17"/>
+                <w:szCs w:val="17"/>
+              </w:rPr>
+              <w:t xml:space="preserve">−$7.8B</w:t>
+            </w:r>
+          </w:p>
+        </w:tc>
+        <w:tc>
+          <w:tcPr>
+            <w:tcW w:type="dxa" w:w="1500"/>
+            <w:tcBorders>
+              <w:top w:val="single" w:color="D9D5CC" w:sz="2"/>
+              <w:left w:val="single" w:color="D9D5CC" w:sz="2"/>
+              <w:bottom w:val="single" w:color="D9D5CC" w:sz="2"/>
+              <w:right w:val="single" w:color="D9D5CC" w:sz="2"/>
+            </w:tcBorders>
+            <w:tcMar>
+              <w:top w:type="dxa" w:w="70"/>
+              <w:left w:type="dxa" w:w="120"/>
+              <w:bottom w:type="dxa" w:w="70"/>
+              <w:right w:type="dxa" w:w="120"/>
+            </w:tcMar>
+            <w:vAlign w:val="center"/>
+          </w:tcPr>
+          <w:p>
+            <w:pPr>
+              <w:spacing w:after="0" w:line="240"/>
+              <w:jc w:val="center"/>
+            </w:pPr>
+            <w:r>
+              <w:rPr>
+                <w:rFonts w:ascii="Georgia" w:cs="Georgia" w:eastAsia="Georgia" w:hAnsi="Georgia"/>
+                <w:sz w:val="17"/>
+                <w:szCs w:val="17"/>
+              </w:rPr>
+              <w:t xml:space="preserve">−$50</w:t>
+            </w:r>
+          </w:p>
+        </w:tc>
+      </w:tr>
+      <w:tr>
+        <w:tc>
+          <w:tcPr>
+            <w:tcW w:type="dxa" w:w="3680"/>
+            <w:tcBorders>
+              <w:top w:val="single" w:color="D9D5CC" w:sz="2"/>
+              <w:left w:val="single" w:color="D9D5CC" w:sz="2"/>
+              <w:bottom w:val="single" w:color="D9D5CC" w:sz="2"/>
+              <w:right w:val="single" w:color="D9D5CC" w:sz="2"/>
+            </w:tcBorders>
+            <w:tcMar>
+              <w:top w:type="dxa" w:w="70"/>
+              <w:left w:type="dxa" w:w="120"/>
+              <w:bottom w:type="dxa" w:w="70"/>
+              <w:right w:type="dxa" w:w="120"/>
+            </w:tcMar>
+            <w:vAlign w:val="center"/>
+          </w:tcPr>
+          <w:p>
+            <w:pPr>
+              <w:spacing w:after="0" w:line="240"/>
+              <w:jc w:val="left"/>
+            </w:pPr>
+            <w:r>
+              <w:rPr>
+                <w:rFonts w:ascii="Georgia" w:cs="Georgia" w:eastAsia="Georgia" w:hAnsi="Georgia"/>
+                <w:sz w:val="17"/>
+                <w:szCs w:val="17"/>
+              </w:rPr>
+              <w:t xml:space="preserve">Less: GIP terminal-cap adjustment</w:t>
+            </w:r>
+          </w:p>
+        </w:tc>
+        <w:tc>
+          <w:tcPr>
+            <w:tcW w:type="dxa" w:w="1400"/>
+            <w:tcBorders>
+              <w:top w:val="single" w:color="D9D5CC" w:sz="2"/>
+              <w:left w:val="single" w:color="D9D5CC" w:sz="2"/>
+              <w:bottom w:val="single" w:color="D9D5CC" w:sz="2"/>
+              <w:right w:val="single" w:color="D9D5CC" w:sz="2"/>
+            </w:tcBorders>
+            <w:tcMar>
+              <w:top w:type="dxa" w:w="70"/>
+              <w:left w:type="dxa" w:w="120"/>
+              <w:bottom w:type="dxa" w:w="70"/>
+              <w:right w:type="dxa" w:w="120"/>
+            </w:tcMar>
+            <w:vAlign w:val="center"/>
+          </w:tcPr>
+          <w:p>
+            <w:pPr>
+              <w:spacing w:after="0" w:line="240"/>
+              <w:jc w:val="left"/>
+            </w:pPr>
+            <w:r>
+              <w:rPr>
+                <w:rFonts w:ascii="Georgia" w:cs="Georgia" w:eastAsia="Georgia" w:hAnsi="Georgia"/>
+                <w:sz w:val="19"/>
+                <w:szCs w:val="19"/>
+              </w:rPr>
+              <w:t xml:space="preserve"/>
+            </w:r>
+          </w:p>
+        </w:tc>
+        <w:tc>
+          <w:tcPr>
+            <w:tcW w:type="dxa" w:w="900"/>
+            <w:tcBorders>
+              <w:top w:val="single" w:color="D9D5CC" w:sz="2"/>
+              <w:left w:val="single" w:color="D9D5CC" w:sz="2"/>
+              <w:bottom w:val="single" w:color="D9D5CC" w:sz="2"/>
+              <w:right w:val="single" w:color="D9D5CC" w:sz="2"/>
+            </w:tcBorders>
+            <w:tcMar>
+              <w:top w:type="dxa" w:w="70"/>
+              <w:left w:type="dxa" w:w="120"/>
+              <w:bottom w:type="dxa" w:w="70"/>
+              <w:right w:type="dxa" w:w="120"/>
+            </w:tcMar>
+            <w:vAlign w:val="center"/>
+          </w:tcPr>
+          <w:p>
+            <w:pPr>
+              <w:spacing w:after="0" w:line="240"/>
+              <w:jc w:val="left"/>
+            </w:pPr>
+            <w:r>
+              <w:rPr>
+                <w:rFonts w:ascii="Georgia" w:cs="Georgia" w:eastAsia="Georgia" w:hAnsi="Georgia"/>
+                <w:sz w:val="19"/>
+                <w:szCs w:val="19"/>
+              </w:rPr>
+              <w:t xml:space="preserve"/>
+            </w:r>
+          </w:p>
+        </w:tc>
+        <w:tc>
+          <w:tcPr>
+            <w:tcW w:type="dxa" w:w="1100"/>
+            <w:tcBorders>
+              <w:top w:val="single" w:color="D9D5CC" w:sz="2"/>
+              <w:left w:val="single" w:color="D9D5CC" w:sz="2"/>
+              <w:bottom w:val="single" w:color="D9D5CC" w:sz="2"/>
+              <w:right w:val="single" w:color="D9D5CC" w:sz="2"/>
+            </w:tcBorders>
+            <w:tcMar>
+              <w:top w:type="dxa" w:w="70"/>
+              <w:left w:type="dxa" w:w="120"/>
+              <w:bottom w:type="dxa" w:w="70"/>
+              <w:right w:type="dxa" w:w="120"/>
+            </w:tcMar>
+            <w:vAlign w:val="center"/>
+          </w:tcPr>
+          <w:p>
+            <w:pPr>
+              <w:spacing w:after="0" w:line="240"/>
+              <w:jc w:val="left"/>
+            </w:pPr>
+            <w:r>
+              <w:rPr>
+                <w:rFonts w:ascii="Georgia" w:cs="Georgia" w:eastAsia="Georgia" w:hAnsi="Georgia"/>
+                <w:sz w:val="19"/>
+                <w:szCs w:val="19"/>
+              </w:rPr>
+              <w:t xml:space="preserve"/>
+            </w:r>
+          </w:p>
+        </w:tc>
+        <w:tc>
+          <w:tcPr>
+            <w:tcW w:type="dxa" w:w="1500"/>
+            <w:tcBorders>
+              <w:top w:val="single" w:color="D9D5CC" w:sz="2"/>
+              <w:left w:val="single" w:color="D9D5CC" w:sz="2"/>
+              <w:bottom w:val="single" w:color="D9D5CC" w:sz="2"/>
+              <w:right w:val="single" w:color="D9D5CC" w:sz="2"/>
+            </w:tcBorders>
+            <w:tcMar>
+              <w:top w:type="dxa" w:w="70"/>
+              <w:left w:type="dxa" w:w="120"/>
+              <w:bottom w:type="dxa" w:w="70"/>
+              <w:right w:type="dxa" w:w="120"/>
+            </w:tcMar>
+            <w:vAlign w:val="center"/>
+          </w:tcPr>
+          <w:p>
+            <w:pPr>
+              <w:spacing w:after="0" w:line="240"/>
+              <w:jc w:val="center"/>
+            </w:pPr>
+            <w:r>
+              <w:rPr>
+                <w:rFonts w:ascii="Georgia" w:cs="Georgia" w:eastAsia="Georgia" w:hAnsi="Georgia"/>
+                <w:sz w:val="17"/>
+                <w:szCs w:val="17"/>
+              </w:rPr>
+              <w:t xml:space="preserve">−$0.4B</w:t>
+            </w:r>
+          </w:p>
+        </w:tc>
+        <w:tc>
+          <w:tcPr>
+            <w:tcW w:type="dxa" w:w="1500"/>
+            <w:tcBorders>
+              <w:top w:val="single" w:color="D9D5CC" w:sz="2"/>
+              <w:left w:val="single" w:color="D9D5CC" w:sz="2"/>
+              <w:bottom w:val="single" w:color="D9D5CC" w:sz="2"/>
+              <w:right w:val="single" w:color="D9D5CC" w:sz="2"/>
+            </w:tcBorders>
+            <w:tcMar>
+              <w:top w:type="dxa" w:w="70"/>
+              <w:left w:type="dxa" w:w="120"/>
+              <w:bottom w:type="dxa" w:w="70"/>
+              <w:right w:type="dxa" w:w="120"/>
+            </w:tcMar>
+            <w:vAlign w:val="center"/>
+          </w:tcPr>
+          <w:p>
+            <w:pPr>
+              <w:spacing w:after="0" w:line="240"/>
+              <w:jc w:val="center"/>
+            </w:pPr>
+            <w:r>
+              <w:rPr>
+                <w:rFonts w:ascii="Georgia" w:cs="Georgia" w:eastAsia="Georgia" w:hAnsi="Georgia"/>
+                <w:sz w:val="17"/>
+                <w:szCs w:val="17"/>
+              </w:rPr>
+              <w:t xml:space="preserve">−$3</w:t>
             </w:r>
           </w:p>
         </w:tc>
@@ -5054,7 +5562,7 @@
                 <w:sz w:val="18"/>
                 <w:szCs w:val="18"/>
               </w:rPr>
-              <w:t xml:space="preserve">$148.6B</w:t>
+              <w:t xml:space="preserve">$140.7B</w:t>
             </w:r>
           </w:p>
         </w:tc>
@@ -5090,7 +5598,7 @@
                 <w:sz w:val="18"/>
                 <w:szCs w:val="18"/>
               </w:rPr>
-              <w:t xml:space="preserve">$959</w:t>
+              <w:t xml:space="preserve">$906</w:t>
             </w:r>
           </w:p>
         </w:tc>
@@ -5109,7 +5617,7 @@
           <w:sz w:val="15"/>
           <w:szCs w:val="15"/>
         </w:rPr>
-        <w:t xml:space="preserve">Rf = 4.45% (10Y UST, Jun 2026); blended ERP 5.40% (geographic-weighted, Damodaran Apr 2026); 155M shares. The +$114 overlay is the platform premium over the mechanical SOTP — the quantified distance between the two lenses; remove it and the conservative read lands near the $825 rate-sensitive value.</w:t>
+        <w:t xml:space="preserve">Rf = 4.30% (10Y UST, May 2026); blended ERP 5.40% (geographic-weighted, Damodaran Apr 2026); 155M shares. The +$115 iShares overlay is the platform premium; the Aladdin and GIP terminal-cap corrections (−$53 combined) hold every segment to a terminal rate at or below Rf — the distinction between the $906 cap-consistent central case and the $959 single-stage upper bound. Strip the overlay and the conservative read lands near the $825 rate-sensitive value.</w:t>
       </w:r>
     </w:p>
     <w:p>
@@ -5128,7 +5636,7 @@
           <w:sz w:val="14"/>
           <w:szCs w:val="14"/>
         </w:rPr>
-        <w:t xml:space="preserve">This document is an academic exercise and does not constitute investment advice. Market data as of mid-June 2026; figures from BlackRock Q1 2026 filings, Federal Reserve H.15, and the Damodaran January/April 2026 datasets.</w:t>
+        <w:t xml:space="preserve">This document is an academic exercise and does not constitute investment advice. Market data as of April 2026; figures from BlackRock 2025 and Q1 2026 filings, Federal Reserve H.15, and the Damodaran January/April 2026 datasets.</w:t>
       </w:r>
     </w:p>
     <w:sectPr>

</xml_diff>